<commit_message>
added progress report ,
I completed task 1 and task 2 over the course of two days
</commit_message>
<xml_diff>
--- a/Progress Report.docx
+++ b/Progress Report.docx
@@ -2,7 +2,2605 @@
 <file path=word/document.xml><?xml version="1.0" encoding="utf-8"?>
 <w:document xmlns:wpc="http://schemas.microsoft.com/office/word/2010/wordprocessingCanvas" xmlns:cx="http://schemas.microsoft.com/office/drawing/2014/chartex" xmlns:cx1="http://schemas.microsoft.com/office/drawing/2015/9/8/chartex" xmlns:cx2="http://schemas.microsoft.com/office/drawing/2015/10/21/chartex" xmlns:cx3="http://schemas.microsoft.com/office/drawing/2016/5/9/chartex" xmlns:cx4="http://schemas.microsoft.com/office/drawing/2016/5/10/chartex" xmlns:cx5="http://schemas.microsoft.com/office/drawing/2016/5/11/chartex" xmlns:cx6="http://schemas.microsoft.com/office/drawing/2016/5/12/chartex" xmlns:cx7="http://schemas.microsoft.com/office/drawing/2016/5/13/chartex" xmlns:cx8="http://schemas.microsoft.com/office/drawing/2016/5/14/chartex" xmlns:mc="http://schemas.openxmlformats.org/markup-compatibility/2006" xmlns:aink="http://schemas.microsoft.com/office/drawing/2016/ink" xmlns:am3d="http://schemas.microsoft.com/office/drawing/2017/model3d" xmlns:o="urn:schemas-microsoft-com:office:office" xmlns:oel="http://schemas.microsoft.com/office/2019/extlst" xmlns:r="http://schemas.openxmlformats.org/officeDocument/2006/relationships" xmlns:m="http://schemas.openxmlformats.org/officeDocument/2006/math" xmlns:v="urn:schemas-microsoft-com:vml" xmlns:wp14="http://schemas.microsoft.com/office/word/2010/wordprocessingDrawing" xmlns:wp="http://schemas.openxmlformats.org/drawingml/2006/wordprocessingDrawing" xmlns:w10="urn:schemas-microsoft-com:office:word" xmlns:w="http://schemas.openxmlformats.org/wordprocessingml/2006/main" xmlns:w14="http://schemas.microsoft.com/office/word/2010/wordml" xmlns:w15="http://schemas.microsoft.com/office/word/2012/wordml" xmlns:w16cex="http://schemas.microsoft.com/office/word/2018/wordml/cex" xmlns:w16cid="http://schemas.microsoft.com/office/word/2016/wordml/cid" xmlns:w16="http://schemas.microsoft.com/office/word/2018/wordml" xmlns:w16du="http://schemas.microsoft.com/office/word/2023/wordml/word16du" xmlns:w16sdtdh="http://schemas.microsoft.com/office/word/2020/wordml/sdtdatahash" xmlns:w16sdtfl="http://schemas.microsoft.com/office/word/2024/wordml/sdtformatlock" xmlns:w16se="http://schemas.microsoft.com/office/word/2015/wordml/symex" xmlns:wpg="http://schemas.microsoft.com/office/word/2010/wordprocessingGroup" xmlns:wpi="http://schemas.microsoft.com/office/word/2010/wordprocessingInk" xmlns:wne="http://schemas.microsoft.com/office/word/2006/wordml" xmlns:wps="http://schemas.microsoft.com/office/word/2010/wordprocessingShape" mc:Ignorable="w14 w15 w16se w16cid w16 w16cex w16sdtdh w16sdtfl w16du wp14">
   <w:body>
+    <w:p>
+      <w:pPr>
+        <w:rPr>
+          <w:b/>
+          <w:bCs/>
+          <w:lang w:val="en-US"/>
+        </w:rPr>
+      </w:pPr>
+      <w:r>
+        <w:rPr>
+          <w:b/>
+          <w:bCs/>
+          <w:lang w:val="en-US"/>
+        </w:rPr>
+        <w:t>Task 1:</w:t>
+      </w:r>
+    </w:p>
+    <w:p>
+      <w:pPr>
+        <w:pStyle w:val="ListParagraph"/>
+        <w:numPr>
+          <w:ilvl w:val="0"/>
+          <w:numId w:val="2"/>
+        </w:numPr>
+        <w:rPr>
+          <w:b/>
+          <w:bCs/>
+          <w:lang w:val="en-US"/>
+        </w:rPr>
+      </w:pPr>
+      <w:r>
+        <w:rPr>
+          <w:b/>
+          <w:bCs/>
+          <w:lang w:val="en-US"/>
+        </w:rPr>
+        <w:t>Overview Of the Selected Organization</w:t>
+      </w:r>
+    </w:p>
+    <w:p>
+      <w:pPr>
+        <w:rPr>
+          <w:b/>
+          <w:bCs/>
+          <w:lang w:val="en-US"/>
+        </w:rPr>
+      </w:pPr>
+      <w:r>
+        <w:rPr>
+          <w:b/>
+          <w:bCs/>
+          <w:lang w:val="en-US"/>
+        </w:rPr>
+        <w:t xml:space="preserve">Problem </w:t>
+      </w:r>
+      <w:r>
+        <w:rPr>
+          <w:b/>
+          <w:bCs/>
+          <w:lang w:val="en-US"/>
+        </w:rPr>
+        <w:t>statement:</w:t>
+      </w:r>
+    </w:p>
+    <w:p>
+      <w:r>
+        <w:t>Mainfreight operates across multiple departments, including operations, warehousing, and customer service, to manage freight and logistics activities. The organisation relies on complex software systems to coordinate shipment operations, manage workflows, and support strategic decision-making.</w:t>
+      </w:r>
+    </w:p>
+    <w:p>
+      <w:r>
+        <w:t>However, due to the scale and complexity of logistics operations, the lack of a well-structured and integrated system can lead to poor visibility of shipment status, delays in communication between departments, and inconsistencies in operational data. These issues contribute to poor maintainability, limited scalability, and increased long-term development risk.</w:t>
+      </w:r>
+    </w:p>
+    <w:p>
+      <w:r>
+        <w:t>To address these challenges, a Shipment Tracking and Logistics Management System is required to provide real-time tracking of shipments, improve coordination across departments, and support effective decision-making within the organisation.</w:t>
+      </w:r>
+    </w:p>
+    <w:p>
+      <w:r>
+        <w:t>Extracting Nouns:</w:t>
+      </w:r>
+    </w:p>
+    <w:p>
+      <w:pPr>
+        <w:pStyle w:val="ListParagraph"/>
+        <w:numPr>
+          <w:ilvl w:val="0"/>
+          <w:numId w:val="1"/>
+        </w:numPr>
+      </w:pPr>
+      <w:r>
+        <w:t>Mainfreight</w:t>
+      </w:r>
+    </w:p>
+    <w:p>
+      <w:pPr>
+        <w:pStyle w:val="ListParagraph"/>
+        <w:numPr>
+          <w:ilvl w:val="0"/>
+          <w:numId w:val="1"/>
+        </w:numPr>
+      </w:pPr>
+      <w:r>
+        <w:t>Departments</w:t>
+      </w:r>
+    </w:p>
+    <w:p>
+      <w:pPr>
+        <w:pStyle w:val="ListParagraph"/>
+        <w:numPr>
+          <w:ilvl w:val="0"/>
+          <w:numId w:val="1"/>
+        </w:numPr>
+      </w:pPr>
+      <w:r>
+        <w:t>Operation</w:t>
+      </w:r>
+    </w:p>
+    <w:p>
+      <w:pPr>
+        <w:pStyle w:val="ListParagraph"/>
+        <w:numPr>
+          <w:ilvl w:val="0"/>
+          <w:numId w:val="1"/>
+        </w:numPr>
+      </w:pPr>
+      <w:r>
+        <w:t>Warehousing</w:t>
+      </w:r>
+    </w:p>
+    <w:p>
+      <w:pPr>
+        <w:pStyle w:val="ListParagraph"/>
+        <w:numPr>
+          <w:ilvl w:val="0"/>
+          <w:numId w:val="1"/>
+        </w:numPr>
+      </w:pPr>
+      <w:r>
+        <w:t>Customer service</w:t>
+      </w:r>
+    </w:p>
+    <w:p>
+      <w:pPr>
+        <w:pStyle w:val="ListParagraph"/>
+        <w:numPr>
+          <w:ilvl w:val="0"/>
+          <w:numId w:val="1"/>
+        </w:numPr>
+      </w:pPr>
+      <w:r>
+        <w:t>Freight</w:t>
+      </w:r>
+    </w:p>
+    <w:p>
+      <w:pPr>
+        <w:pStyle w:val="ListParagraph"/>
+        <w:numPr>
+          <w:ilvl w:val="0"/>
+          <w:numId w:val="1"/>
+        </w:numPr>
+      </w:pPr>
+      <w:r>
+        <w:t>Logistics</w:t>
+      </w:r>
+    </w:p>
+    <w:p>
+      <w:pPr>
+        <w:pStyle w:val="ListParagraph"/>
+        <w:numPr>
+          <w:ilvl w:val="0"/>
+          <w:numId w:val="1"/>
+        </w:numPr>
+      </w:pPr>
+      <w:r>
+        <w:t>Software systems</w:t>
+      </w:r>
+    </w:p>
+    <w:p>
+      <w:pPr>
+        <w:pStyle w:val="ListParagraph"/>
+        <w:numPr>
+          <w:ilvl w:val="0"/>
+          <w:numId w:val="1"/>
+        </w:numPr>
+      </w:pPr>
+      <w:r>
+        <w:t>Shipment operations</w:t>
+      </w:r>
+    </w:p>
+    <w:p>
+      <w:pPr>
+        <w:pStyle w:val="ListParagraph"/>
+        <w:numPr>
+          <w:ilvl w:val="0"/>
+          <w:numId w:val="1"/>
+        </w:numPr>
+      </w:pPr>
+      <w:r>
+        <w:t>Workflows</w:t>
+      </w:r>
+    </w:p>
+    <w:p>
+      <w:pPr>
+        <w:pStyle w:val="ListParagraph"/>
+        <w:numPr>
+          <w:ilvl w:val="0"/>
+          <w:numId w:val="1"/>
+        </w:numPr>
+      </w:pPr>
+      <w:r>
+        <w:t>Decision</w:t>
+      </w:r>
+      <w:r>
+        <w:t xml:space="preserve"> makin</w:t>
+      </w:r>
+      <w:r>
+        <w:t>g</w:t>
+      </w:r>
+    </w:p>
+    <w:p>
+      <w:pPr>
+        <w:pStyle w:val="ListParagraph"/>
+        <w:numPr>
+          <w:ilvl w:val="0"/>
+          <w:numId w:val="1"/>
+        </w:numPr>
+      </w:pPr>
+      <w:r>
+        <w:t xml:space="preserve">Scale </w:t>
+      </w:r>
+    </w:p>
+    <w:p>
+      <w:pPr>
+        <w:pStyle w:val="ListParagraph"/>
+        <w:numPr>
+          <w:ilvl w:val="0"/>
+          <w:numId w:val="1"/>
+        </w:numPr>
+      </w:pPr>
+      <w:r>
+        <w:t>Complexity</w:t>
+      </w:r>
+    </w:p>
+    <w:p>
+      <w:pPr>
+        <w:pStyle w:val="ListParagraph"/>
+        <w:numPr>
+          <w:ilvl w:val="0"/>
+          <w:numId w:val="1"/>
+        </w:numPr>
+      </w:pPr>
+      <w:r>
+        <w:t>System</w:t>
+      </w:r>
+    </w:p>
+    <w:p>
+      <w:pPr>
+        <w:pStyle w:val="ListParagraph"/>
+        <w:numPr>
+          <w:ilvl w:val="0"/>
+          <w:numId w:val="1"/>
+        </w:numPr>
+      </w:pPr>
+      <w:r>
+        <w:t>Visibility</w:t>
+      </w:r>
+    </w:p>
+    <w:p>
+      <w:pPr>
+        <w:pStyle w:val="ListParagraph"/>
+        <w:numPr>
+          <w:ilvl w:val="0"/>
+          <w:numId w:val="1"/>
+        </w:numPr>
+      </w:pPr>
+      <w:r>
+        <w:t>Shipment status</w:t>
+      </w:r>
+    </w:p>
+    <w:p>
+      <w:pPr>
+        <w:pStyle w:val="ListParagraph"/>
+        <w:numPr>
+          <w:ilvl w:val="0"/>
+          <w:numId w:val="1"/>
+        </w:numPr>
+      </w:pPr>
+      <w:r>
+        <w:t>Communication</w:t>
+      </w:r>
+    </w:p>
+    <w:p>
+      <w:pPr>
+        <w:pStyle w:val="ListParagraph"/>
+        <w:numPr>
+          <w:ilvl w:val="0"/>
+          <w:numId w:val="1"/>
+        </w:numPr>
+      </w:pPr>
+      <w:r>
+        <w:t>Data</w:t>
+      </w:r>
+    </w:p>
+    <w:p>
+      <w:pPr>
+        <w:pStyle w:val="ListParagraph"/>
+        <w:numPr>
+          <w:ilvl w:val="0"/>
+          <w:numId w:val="1"/>
+        </w:numPr>
+      </w:pPr>
+      <w:r>
+        <w:t>Issues</w:t>
+      </w:r>
+    </w:p>
+    <w:p>
+      <w:pPr>
+        <w:pStyle w:val="ListParagraph"/>
+        <w:numPr>
+          <w:ilvl w:val="0"/>
+          <w:numId w:val="1"/>
+        </w:numPr>
+      </w:pPr>
+      <w:r>
+        <w:t>Maintainability</w:t>
+      </w:r>
+    </w:p>
+    <w:p>
+      <w:pPr>
+        <w:pStyle w:val="ListParagraph"/>
+        <w:numPr>
+          <w:ilvl w:val="0"/>
+          <w:numId w:val="1"/>
+        </w:numPr>
+      </w:pPr>
+      <w:r>
+        <w:t>Scalability</w:t>
+      </w:r>
+    </w:p>
+    <w:p>
+      <w:pPr>
+        <w:pStyle w:val="ListParagraph"/>
+        <w:numPr>
+          <w:ilvl w:val="0"/>
+          <w:numId w:val="1"/>
+        </w:numPr>
+      </w:pPr>
+      <w:r>
+        <w:lastRenderedPageBreak/>
+        <w:t>Development</w:t>
+      </w:r>
+      <w:r>
+        <w:t xml:space="preserve"> risk</w:t>
+      </w:r>
+    </w:p>
+    <w:p>
+      <w:pPr>
+        <w:pStyle w:val="ListParagraph"/>
+        <w:numPr>
+          <w:ilvl w:val="0"/>
+          <w:numId w:val="1"/>
+        </w:numPr>
+      </w:pPr>
+      <w:r>
+        <w:t xml:space="preserve">Shipment tracking and </w:t>
+      </w:r>
+      <w:r>
+        <w:t>logistics</w:t>
+      </w:r>
+      <w:r>
+        <w:t xml:space="preserve"> management system</w:t>
+      </w:r>
+    </w:p>
+    <w:p>
+      <w:pPr>
+        <w:pStyle w:val="ListParagraph"/>
+        <w:numPr>
+          <w:ilvl w:val="0"/>
+          <w:numId w:val="1"/>
+        </w:numPr>
+      </w:pPr>
+      <w:r>
+        <w:t>Tracking</w:t>
+      </w:r>
+    </w:p>
+    <w:p>
+      <w:pPr>
+        <w:pStyle w:val="ListParagraph"/>
+        <w:numPr>
+          <w:ilvl w:val="0"/>
+          <w:numId w:val="1"/>
+        </w:numPr>
+      </w:pPr>
+      <w:r>
+        <w:t>Shipment</w:t>
+      </w:r>
+    </w:p>
+    <w:p>
+      <w:pPr>
+        <w:pStyle w:val="ListParagraph"/>
+        <w:numPr>
+          <w:ilvl w:val="0"/>
+          <w:numId w:val="1"/>
+        </w:numPr>
+      </w:pPr>
+      <w:r>
+        <w:t>coordination</w:t>
+      </w:r>
+    </w:p>
+    <w:p>
+      <w:r>
+        <w:t>Extracting Verbs:</w:t>
+      </w:r>
+    </w:p>
+    <w:p>
+      <w:pPr>
+        <w:pStyle w:val="ListParagraph"/>
+        <w:numPr>
+          <w:ilvl w:val="0"/>
+          <w:numId w:val="1"/>
+        </w:numPr>
+      </w:pPr>
+      <w:r>
+        <w:t>operates</w:t>
+      </w:r>
+    </w:p>
+    <w:p>
+      <w:pPr>
+        <w:pStyle w:val="ListParagraph"/>
+        <w:numPr>
+          <w:ilvl w:val="0"/>
+          <w:numId w:val="1"/>
+        </w:numPr>
+      </w:pPr>
+      <w:r>
+        <w:t>manage</w:t>
+      </w:r>
+    </w:p>
+    <w:p>
+      <w:pPr>
+        <w:pStyle w:val="ListParagraph"/>
+        <w:numPr>
+          <w:ilvl w:val="0"/>
+          <w:numId w:val="1"/>
+        </w:numPr>
+      </w:pPr>
+      <w:r>
+        <w:t>relies</w:t>
+      </w:r>
+    </w:p>
+    <w:p>
+      <w:pPr>
+        <w:pStyle w:val="ListParagraph"/>
+        <w:numPr>
+          <w:ilvl w:val="0"/>
+          <w:numId w:val="1"/>
+        </w:numPr>
+      </w:pPr>
+      <w:r>
+        <w:t>coordinate</w:t>
+      </w:r>
+    </w:p>
+    <w:p>
+      <w:pPr>
+        <w:pStyle w:val="ListParagraph"/>
+        <w:numPr>
+          <w:ilvl w:val="0"/>
+          <w:numId w:val="1"/>
+        </w:numPr>
+      </w:pPr>
+      <w:r>
+        <w:t>manage</w:t>
+      </w:r>
+    </w:p>
+    <w:p>
+      <w:pPr>
+        <w:pStyle w:val="ListParagraph"/>
+        <w:numPr>
+          <w:ilvl w:val="0"/>
+          <w:numId w:val="1"/>
+        </w:numPr>
+      </w:pPr>
+      <w:r>
+        <w:t>support</w:t>
+      </w:r>
+    </w:p>
+    <w:p>
+      <w:pPr>
+        <w:pStyle w:val="ListParagraph"/>
+        <w:numPr>
+          <w:ilvl w:val="0"/>
+          <w:numId w:val="1"/>
+        </w:numPr>
+      </w:pPr>
+      <w:r>
+        <w:t>lead</w:t>
+      </w:r>
+    </w:p>
+    <w:p>
+      <w:pPr>
+        <w:pStyle w:val="ListParagraph"/>
+        <w:numPr>
+          <w:ilvl w:val="0"/>
+          <w:numId w:val="1"/>
+        </w:numPr>
+      </w:pPr>
+      <w:r>
+        <w:t>contribute</w:t>
+      </w:r>
+    </w:p>
+    <w:p>
+      <w:pPr>
+        <w:pStyle w:val="ListParagraph"/>
+        <w:numPr>
+          <w:ilvl w:val="0"/>
+          <w:numId w:val="1"/>
+        </w:numPr>
+      </w:pPr>
+      <w:r>
+        <w:t>address</w:t>
+      </w:r>
+    </w:p>
+    <w:p>
+      <w:pPr>
+        <w:pStyle w:val="ListParagraph"/>
+        <w:numPr>
+          <w:ilvl w:val="0"/>
+          <w:numId w:val="1"/>
+        </w:numPr>
+      </w:pPr>
+      <w:r>
+        <w:t>provide</w:t>
+      </w:r>
+    </w:p>
+    <w:p>
+      <w:pPr>
+        <w:pStyle w:val="ListParagraph"/>
+        <w:numPr>
+          <w:ilvl w:val="0"/>
+          <w:numId w:val="1"/>
+        </w:numPr>
+      </w:pPr>
+      <w:r>
+        <w:t>improve</w:t>
+      </w:r>
+    </w:p>
+    <w:p>
+      <w:pPr>
+        <w:pStyle w:val="ListParagraph"/>
+      </w:pPr>
+    </w:p>
+    <w:p>
+      <w:r>
+        <w:t>Nouns after eliminating</w:t>
+      </w:r>
+      <w:r>
+        <w:t>:</w:t>
+      </w:r>
+      <w:r>
+        <w:t xml:space="preserve"> ( Rele</w:t>
+      </w:r>
+      <w:r>
+        <w:t>vant System Elements)</w:t>
+      </w:r>
+    </w:p>
+    <w:p>
+      <w:pPr>
+        <w:pStyle w:val="ListParagraph"/>
+        <w:numPr>
+          <w:ilvl w:val="0"/>
+          <w:numId w:val="1"/>
+        </w:numPr>
+      </w:pPr>
+      <w:r>
+        <w:t>shipments</w:t>
+      </w:r>
+    </w:p>
+    <w:p>
+      <w:pPr>
+        <w:pStyle w:val="ListParagraph"/>
+        <w:numPr>
+          <w:ilvl w:val="0"/>
+          <w:numId w:val="1"/>
+        </w:numPr>
+      </w:pPr>
+      <w:r>
+        <w:t>shipment status</w:t>
+      </w:r>
+    </w:p>
+    <w:p>
+      <w:pPr>
+        <w:pStyle w:val="ListParagraph"/>
+        <w:numPr>
+          <w:ilvl w:val="0"/>
+          <w:numId w:val="1"/>
+        </w:numPr>
+      </w:pPr>
+      <w:r>
+        <w:t>shipment operations</w:t>
+      </w:r>
+    </w:p>
+    <w:p>
+      <w:pPr>
+        <w:pStyle w:val="ListParagraph"/>
+        <w:numPr>
+          <w:ilvl w:val="0"/>
+          <w:numId w:val="1"/>
+        </w:numPr>
+      </w:pPr>
+      <w:r>
+        <w:t>workflows</w:t>
+      </w:r>
+    </w:p>
+    <w:p>
+      <w:pPr>
+        <w:pStyle w:val="ListParagraph"/>
+        <w:numPr>
+          <w:ilvl w:val="0"/>
+          <w:numId w:val="1"/>
+        </w:numPr>
+      </w:pPr>
+      <w:r>
+        <w:t>data</w:t>
+      </w:r>
+    </w:p>
+    <w:p>
+      <w:pPr>
+        <w:pStyle w:val="ListParagraph"/>
+        <w:numPr>
+          <w:ilvl w:val="0"/>
+          <w:numId w:val="1"/>
+        </w:numPr>
+      </w:pPr>
+      <w:r>
+        <w:t>operations</w:t>
+      </w:r>
+    </w:p>
+    <w:p>
+      <w:pPr>
+        <w:pStyle w:val="ListParagraph"/>
+        <w:numPr>
+          <w:ilvl w:val="0"/>
+          <w:numId w:val="1"/>
+        </w:numPr>
+      </w:pPr>
+      <w:r>
+        <w:t>warehousing</w:t>
+      </w:r>
+    </w:p>
+    <w:p>
+      <w:pPr>
+        <w:pStyle w:val="ListParagraph"/>
+        <w:numPr>
+          <w:ilvl w:val="0"/>
+          <w:numId w:val="1"/>
+        </w:numPr>
+      </w:pPr>
+      <w:r>
+        <w:t>customer service</w:t>
+      </w:r>
+    </w:p>
+    <w:p>
+      <w:pPr>
+        <w:pStyle w:val="ListParagraph"/>
+        <w:numPr>
+          <w:ilvl w:val="0"/>
+          <w:numId w:val="1"/>
+        </w:numPr>
+      </w:pPr>
+      <w:r>
+        <w:t>tracking</w:t>
+      </w:r>
+    </w:p>
+    <w:p>
+      <w:pPr>
+        <w:pStyle w:val="ListParagraph"/>
+        <w:numPr>
+          <w:ilvl w:val="0"/>
+          <w:numId w:val="1"/>
+        </w:numPr>
+      </w:pPr>
+      <w:r>
+        <w:t>shipment tracking and logistics management systems</w:t>
+      </w:r>
+    </w:p>
+    <w:p>
+      <w:r>
+        <w:t xml:space="preserve">Verbs after eliminating </w:t>
+      </w:r>
+      <w:r>
+        <w:t xml:space="preserve"> (Relevant Actions)</w:t>
+      </w:r>
+    </w:p>
+    <w:p>
+      <w:pPr>
+        <w:pStyle w:val="ListParagraph"/>
+        <w:numPr>
+          <w:ilvl w:val="0"/>
+          <w:numId w:val="1"/>
+        </w:numPr>
+      </w:pPr>
+      <w:r>
+        <w:t>manage</w:t>
+      </w:r>
+    </w:p>
+    <w:p>
+      <w:pPr>
+        <w:pStyle w:val="ListParagraph"/>
+        <w:numPr>
+          <w:ilvl w:val="0"/>
+          <w:numId w:val="1"/>
+        </w:numPr>
+      </w:pPr>
+      <w:r>
+        <w:t>coordinate</w:t>
+      </w:r>
+    </w:p>
+    <w:p>
+      <w:pPr>
+        <w:pStyle w:val="ListParagraph"/>
+        <w:numPr>
+          <w:ilvl w:val="0"/>
+          <w:numId w:val="1"/>
+        </w:numPr>
+      </w:pPr>
+      <w:r>
+        <w:t>provide</w:t>
+      </w:r>
+    </w:p>
+    <w:p>
+      <w:pPr>
+        <w:pStyle w:val="ListParagraph"/>
+        <w:numPr>
+          <w:ilvl w:val="0"/>
+          <w:numId w:val="1"/>
+        </w:numPr>
+      </w:pPr>
+      <w:r>
+        <w:t>improve</w:t>
+      </w:r>
+    </w:p>
+    <w:p>
+      <w:pPr>
+        <w:ind w:left="360"/>
+      </w:pPr>
+    </w:p>
+    <w:p>
+      <w:r>
+        <w:t>Refined System Actions</w:t>
+      </w:r>
+      <w:r>
+        <w:t>:</w:t>
+      </w:r>
+    </w:p>
+    <w:p>
+      <w:pPr>
+        <w:pStyle w:val="ListParagraph"/>
+        <w:numPr>
+          <w:ilvl w:val="0"/>
+          <w:numId w:val="1"/>
+        </w:numPr>
+      </w:pPr>
+      <w:r>
+        <w:t>track shipments</w:t>
+      </w:r>
+    </w:p>
+    <w:p>
+      <w:pPr>
+        <w:pStyle w:val="ListParagraph"/>
+        <w:numPr>
+          <w:ilvl w:val="0"/>
+          <w:numId w:val="1"/>
+        </w:numPr>
+      </w:pPr>
+      <w:r>
+        <w:lastRenderedPageBreak/>
+        <w:t>update shipment Status</w:t>
+      </w:r>
+    </w:p>
+    <w:p>
+      <w:pPr>
+        <w:pStyle w:val="ListParagraph"/>
+        <w:numPr>
+          <w:ilvl w:val="0"/>
+          <w:numId w:val="1"/>
+        </w:numPr>
+      </w:pPr>
+      <w:r>
+        <w:t>manage shipment operations</w:t>
+      </w:r>
+    </w:p>
+    <w:p>
+      <w:pPr>
+        <w:pStyle w:val="ListParagraph"/>
+        <w:numPr>
+          <w:ilvl w:val="0"/>
+          <w:numId w:val="1"/>
+        </w:numPr>
+      </w:pPr>
+      <w:r>
+        <w:t>mange workflows</w:t>
+      </w:r>
+    </w:p>
+    <w:p>
+      <w:pPr>
+        <w:pStyle w:val="ListParagraph"/>
+        <w:numPr>
+          <w:ilvl w:val="0"/>
+          <w:numId w:val="1"/>
+        </w:numPr>
+      </w:pPr>
+      <w:r>
+        <w:t>coordinate shipment operations</w:t>
+      </w:r>
+    </w:p>
+    <w:p>
+      <w:pPr>
+        <w:pStyle w:val="ListParagraph"/>
+        <w:numPr>
+          <w:ilvl w:val="0"/>
+          <w:numId w:val="1"/>
+        </w:numPr>
+      </w:pPr>
+      <w:r>
+        <w:t>provide tracking information</w:t>
+      </w:r>
+    </w:p>
+    <w:p>
+      <w:pPr>
+        <w:pStyle w:val="ListParagraph"/>
+        <w:numPr>
+          <w:ilvl w:val="0"/>
+          <w:numId w:val="1"/>
+        </w:numPr>
+      </w:pPr>
+      <w:r>
+        <w:t>improve coordination</w:t>
+      </w:r>
+    </w:p>
+    <w:p>
+      <w:pPr>
+        <w:rPr>
+          <w:b/>
+          <w:bCs/>
+        </w:rPr>
+      </w:pPr>
+    </w:p>
+    <w:p>
+      <w:pPr>
+        <w:rPr>
+          <w:b/>
+          <w:bCs/>
+        </w:rPr>
+      </w:pPr>
+      <w:r>
+        <w:rPr>
+          <w:b/>
+          <w:bCs/>
+        </w:rPr>
+        <w:t xml:space="preserve">2. </w:t>
+      </w:r>
+      <w:r>
+        <w:rPr>
+          <w:b/>
+          <w:bCs/>
+        </w:rPr>
+        <w:t xml:space="preserve"> </w:t>
+      </w:r>
+      <w:r>
+        <w:rPr>
+          <w:b/>
+          <w:bCs/>
+        </w:rPr>
+        <w:t>Departmental Structure and Responsibilities</w:t>
+      </w:r>
+    </w:p>
+    <w:p>
+      <w:r>
+        <w:t xml:space="preserve">Group </w:t>
+      </w:r>
+      <w:r>
+        <w:t>N</w:t>
+      </w:r>
+      <w:r>
+        <w:t xml:space="preserve">ouns into </w:t>
+      </w:r>
+      <w:r>
+        <w:t>D</w:t>
+      </w:r>
+      <w:r>
+        <w:t>epartments:</w:t>
+      </w:r>
+    </w:p>
     <w:p/>
+    <w:p>
+      <w:pPr>
+        <w:pStyle w:val="ListParagraph"/>
+        <w:numPr>
+          <w:ilvl w:val="0"/>
+          <w:numId w:val="1"/>
+        </w:numPr>
+      </w:pPr>
+      <w:r>
+        <w:t>Operations:</w:t>
+      </w:r>
+    </w:p>
+    <w:p>
+      <w:pPr>
+        <w:pStyle w:val="ListParagraph"/>
+        <w:numPr>
+          <w:ilvl w:val="1"/>
+          <w:numId w:val="1"/>
+        </w:numPr>
+      </w:pPr>
+      <w:r>
+        <w:t>Shipments</w:t>
+      </w:r>
+    </w:p>
+    <w:p>
+      <w:pPr>
+        <w:pStyle w:val="ListParagraph"/>
+        <w:numPr>
+          <w:ilvl w:val="1"/>
+          <w:numId w:val="1"/>
+        </w:numPr>
+      </w:pPr>
+      <w:r>
+        <w:t>Shipment operations</w:t>
+      </w:r>
+    </w:p>
+    <w:p>
+      <w:pPr>
+        <w:pStyle w:val="ListParagraph"/>
+        <w:numPr>
+          <w:ilvl w:val="1"/>
+          <w:numId w:val="1"/>
+        </w:numPr>
+      </w:pPr>
+      <w:r>
+        <w:t>Tracking</w:t>
+      </w:r>
+    </w:p>
+    <w:p>
+      <w:pPr>
+        <w:ind w:left="1080"/>
+      </w:pPr>
+    </w:p>
+    <w:p>
+      <w:pPr>
+        <w:pStyle w:val="ListParagraph"/>
+        <w:numPr>
+          <w:ilvl w:val="0"/>
+          <w:numId w:val="1"/>
+        </w:numPr>
+      </w:pPr>
+      <w:r>
+        <w:t>Warehouse</w:t>
+      </w:r>
+    </w:p>
+    <w:p>
+      <w:pPr>
+        <w:pStyle w:val="ListParagraph"/>
+        <w:numPr>
+          <w:ilvl w:val="1"/>
+          <w:numId w:val="1"/>
+        </w:numPr>
+      </w:pPr>
+      <w:r>
+        <w:t>Warehousing</w:t>
+      </w:r>
+    </w:p>
+    <w:p>
+      <w:pPr>
+        <w:pStyle w:val="ListParagraph"/>
+        <w:numPr>
+          <w:ilvl w:val="1"/>
+          <w:numId w:val="1"/>
+        </w:numPr>
+      </w:pPr>
+      <w:r>
+        <w:t>Data</w:t>
+      </w:r>
+    </w:p>
+    <w:p>
+      <w:pPr>
+        <w:pStyle w:val="ListParagraph"/>
+        <w:numPr>
+          <w:ilvl w:val="0"/>
+          <w:numId w:val="1"/>
+        </w:numPr>
+      </w:pPr>
+      <w:r>
+        <w:t>Customer service</w:t>
+      </w:r>
+    </w:p>
+    <w:p>
+      <w:pPr>
+        <w:pStyle w:val="ListParagraph"/>
+        <w:numPr>
+          <w:ilvl w:val="1"/>
+          <w:numId w:val="1"/>
+        </w:numPr>
+      </w:pPr>
+      <w:r>
+        <w:t xml:space="preserve">Shipment status </w:t>
+      </w:r>
+    </w:p>
+    <w:p>
+      <w:pPr>
+        <w:pStyle w:val="ListParagraph"/>
+        <w:numPr>
+          <w:ilvl w:val="1"/>
+          <w:numId w:val="1"/>
+        </w:numPr>
+      </w:pPr>
+      <w:r>
+        <w:t>Workflows</w:t>
+      </w:r>
+    </w:p>
+    <w:p>
+      <w:pPr>
+        <w:pStyle w:val="ListParagraph"/>
+        <w:numPr>
+          <w:ilvl w:val="0"/>
+          <w:numId w:val="1"/>
+        </w:numPr>
+      </w:pPr>
+      <w:r>
+        <w:t xml:space="preserve">Core </w:t>
+      </w:r>
+      <w:r>
+        <w:t>System</w:t>
+      </w:r>
+    </w:p>
+    <w:p>
+      <w:pPr>
+        <w:pStyle w:val="ListParagraph"/>
+        <w:numPr>
+          <w:ilvl w:val="1"/>
+          <w:numId w:val="1"/>
+        </w:numPr>
+      </w:pPr>
+      <w:r>
+        <w:t xml:space="preserve">Shipment tracking and </w:t>
+      </w:r>
+      <w:r>
+        <w:t>logistics</w:t>
+      </w:r>
+      <w:r>
+        <w:t xml:space="preserve"> management system</w:t>
+      </w:r>
+    </w:p>
+    <w:p/>
+    <w:p>
+      <w:pPr>
+        <w:rPr>
+          <w:b/>
+          <w:bCs/>
+        </w:rPr>
+      </w:pPr>
+      <w:r>
+        <w:rPr>
+          <w:b/>
+          <w:bCs/>
+        </w:rPr>
+        <w:t>3.</w:t>
+      </w:r>
+      <w:r>
+        <w:rPr>
+          <w:b/>
+          <w:bCs/>
+        </w:rPr>
+        <w:t xml:space="preserve">Identification of </w:t>
+      </w:r>
+      <w:r>
+        <w:rPr>
+          <w:b/>
+          <w:bCs/>
+        </w:rPr>
+        <w:t>Stakeholders</w:t>
+      </w:r>
+      <w:r>
+        <w:rPr>
+          <w:b/>
+          <w:bCs/>
+        </w:rPr>
+        <w:t xml:space="preserve"> and User Roles</w:t>
+      </w:r>
+      <w:r>
+        <w:rPr>
+          <w:b/>
+          <w:bCs/>
+        </w:rPr>
+        <w:t>:</w:t>
+      </w:r>
+    </w:p>
+    <w:p>
+      <w:r>
+        <w:t>What are stakeholders?</w:t>
+      </w:r>
+    </w:p>
+    <w:p>
+      <w:r>
+        <w:t xml:space="preserve">Stakeholders </w:t>
+      </w:r>
+      <w:r>
+        <w:t>are</w:t>
+      </w:r>
+      <w:r>
+        <w:t xml:space="preserve"> </w:t>
+      </w:r>
+      <w:r>
+        <w:t>individuals</w:t>
+      </w:r>
+      <w:r>
+        <w:t xml:space="preserve">, </w:t>
+      </w:r>
+      <w:r>
+        <w:t>groups</w:t>
+      </w:r>
+      <w:r>
+        <w:t xml:space="preserve"> or </w:t>
+      </w:r>
+      <w:r>
+        <w:t>organisations</w:t>
+      </w:r>
+      <w:r>
+        <w:t xml:space="preserve"> that </w:t>
+      </w:r>
+      <w:r>
+        <w:t>have</w:t>
+      </w:r>
+      <w:r>
+        <w:t xml:space="preserve"> an interest in the company , project or the </w:t>
+      </w:r>
+      <w:r>
+        <w:t>policy</w:t>
+      </w:r>
+      <w:r>
+        <w:t xml:space="preserve">. </w:t>
+      </w:r>
+      <w:r>
+        <w:t>They</w:t>
+      </w:r>
+      <w:r>
+        <w:t xml:space="preserve"> are the parties at affect or are affected by the performance of said </w:t>
+      </w:r>
+      <w:r>
+        <w:t>company</w:t>
+      </w:r>
+      <w:r>
+        <w:t xml:space="preserve"> or project,</w:t>
+      </w:r>
+    </w:p>
+    <w:p/>
+    <w:p>
+      <w:r>
+        <w:t>Stakeholders for this project:</w:t>
+      </w:r>
+    </w:p>
+    <w:p/>
+    <w:p>
+      <w:pPr>
+        <w:pStyle w:val="ListParagraph"/>
+        <w:numPr>
+          <w:ilvl w:val="0"/>
+          <w:numId w:val="1"/>
+        </w:numPr>
+      </w:pPr>
+      <w:r>
+        <w:t>Customer</w:t>
+      </w:r>
+    </w:p>
+    <w:p>
+      <w:pPr>
+        <w:pStyle w:val="ListParagraph"/>
+        <w:numPr>
+          <w:ilvl w:val="0"/>
+          <w:numId w:val="1"/>
+        </w:numPr>
+      </w:pPr>
+      <w:r>
+        <w:t>Operations staff</w:t>
+      </w:r>
+    </w:p>
+    <w:p>
+      <w:pPr>
+        <w:pStyle w:val="ListParagraph"/>
+        <w:numPr>
+          <w:ilvl w:val="0"/>
+          <w:numId w:val="1"/>
+        </w:numPr>
+      </w:pPr>
+      <w:r>
+        <w:lastRenderedPageBreak/>
+        <w:t>Warehouse staff</w:t>
+      </w:r>
+    </w:p>
+    <w:p>
+      <w:pPr>
+        <w:pStyle w:val="ListParagraph"/>
+        <w:numPr>
+          <w:ilvl w:val="0"/>
+          <w:numId w:val="1"/>
+        </w:numPr>
+      </w:pPr>
+      <w:r>
+        <w:t>Customer service staff</w:t>
+      </w:r>
+    </w:p>
+    <w:p>
+      <w:pPr>
+        <w:pStyle w:val="ListParagraph"/>
+        <w:numPr>
+          <w:ilvl w:val="0"/>
+          <w:numId w:val="1"/>
+        </w:numPr>
+      </w:pPr>
+      <w:r>
+        <w:t xml:space="preserve">Manager </w:t>
+      </w:r>
+    </w:p>
+    <w:p>
+      <w:pPr>
+        <w:pStyle w:val="ListParagraph"/>
+        <w:numPr>
+          <w:ilvl w:val="0"/>
+          <w:numId w:val="1"/>
+        </w:numPr>
+      </w:pPr>
+      <w:r>
+        <w:t>IT Admin</w:t>
+      </w:r>
+    </w:p>
+    <w:p/>
+    <w:p>
+      <w:r>
+        <w:t>Stakeholder and User roles (Who they are and what their role is)</w:t>
+      </w:r>
+    </w:p>
+    <w:p/>
+    <w:p>
+      <w:pPr>
+        <w:pStyle w:val="ListParagraph"/>
+        <w:numPr>
+          <w:ilvl w:val="0"/>
+          <w:numId w:val="1"/>
+        </w:numPr>
+      </w:pPr>
+      <w:r>
+        <w:t>Customer(</w:t>
+      </w:r>
+      <w:r>
+        <w:t xml:space="preserve">External </w:t>
+      </w:r>
+      <w:r>
+        <w:t>Stakeholders)</w:t>
+      </w:r>
+    </w:p>
+    <w:p>
+      <w:pPr>
+        <w:pStyle w:val="ListParagraph"/>
+        <w:numPr>
+          <w:ilvl w:val="1"/>
+          <w:numId w:val="1"/>
+        </w:numPr>
+      </w:pPr>
+      <w:r>
+        <w:t>Track shipment using tracking information</w:t>
+      </w:r>
+    </w:p>
+    <w:p>
+      <w:pPr>
+        <w:pStyle w:val="ListParagraph"/>
+        <w:numPr>
+          <w:ilvl w:val="1"/>
+          <w:numId w:val="1"/>
+        </w:numPr>
+      </w:pPr>
+      <w:r>
+        <w:t>View shipment status</w:t>
+      </w:r>
+    </w:p>
+    <w:p>
+      <w:pPr>
+        <w:pStyle w:val="ListParagraph"/>
+        <w:numPr>
+          <w:ilvl w:val="0"/>
+          <w:numId w:val="1"/>
+        </w:numPr>
+      </w:pPr>
+      <w:r>
+        <w:t xml:space="preserve">Operation staff </w:t>
+      </w:r>
+      <w:r>
+        <w:t>(Internal users)</w:t>
+      </w:r>
+    </w:p>
+    <w:p>
+      <w:pPr>
+        <w:pStyle w:val="ListParagraph"/>
+        <w:numPr>
+          <w:ilvl w:val="1"/>
+          <w:numId w:val="1"/>
+        </w:numPr>
+      </w:pPr>
+      <w:r>
+        <w:t xml:space="preserve">Mange shipment </w:t>
+      </w:r>
+      <w:r>
+        <w:t>operations</w:t>
+      </w:r>
+    </w:p>
+    <w:p>
+      <w:pPr>
+        <w:pStyle w:val="ListParagraph"/>
+        <w:numPr>
+          <w:ilvl w:val="1"/>
+          <w:numId w:val="1"/>
+        </w:numPr>
+      </w:pPr>
+      <w:r>
+        <w:t>Track shipments</w:t>
+      </w:r>
+    </w:p>
+    <w:p>
+      <w:pPr>
+        <w:pStyle w:val="ListParagraph"/>
+        <w:numPr>
+          <w:ilvl w:val="1"/>
+          <w:numId w:val="1"/>
+        </w:numPr>
+      </w:pPr>
+      <w:r>
+        <w:t xml:space="preserve">Coordinate shipment </w:t>
+      </w:r>
+      <w:r>
+        <w:t>activities</w:t>
+      </w:r>
+    </w:p>
+    <w:p>
+      <w:pPr>
+        <w:pStyle w:val="ListParagraph"/>
+        <w:numPr>
+          <w:ilvl w:val="0"/>
+          <w:numId w:val="1"/>
+        </w:numPr>
+      </w:pPr>
+      <w:r>
+        <w:t>Warehouse staff (internal Users)</w:t>
+      </w:r>
+    </w:p>
+    <w:p>
+      <w:pPr>
+        <w:pStyle w:val="ListParagraph"/>
+        <w:numPr>
+          <w:ilvl w:val="1"/>
+          <w:numId w:val="1"/>
+        </w:numPr>
+      </w:pPr>
+      <w:r>
+        <w:t>Update shipment status</w:t>
+      </w:r>
+    </w:p>
+    <w:p>
+      <w:pPr>
+        <w:pStyle w:val="ListParagraph"/>
+        <w:numPr>
+          <w:ilvl w:val="1"/>
+          <w:numId w:val="1"/>
+        </w:numPr>
+      </w:pPr>
+      <w:r>
+        <w:t xml:space="preserve">Manage </w:t>
+      </w:r>
+      <w:r>
+        <w:t>inventory</w:t>
+      </w:r>
+      <w:r>
+        <w:t xml:space="preserve">/data related to </w:t>
+      </w:r>
+      <w:r>
+        <w:t>shipments</w:t>
+      </w:r>
+    </w:p>
+    <w:p>
+      <w:pPr>
+        <w:pStyle w:val="ListParagraph"/>
+        <w:numPr>
+          <w:ilvl w:val="0"/>
+          <w:numId w:val="1"/>
+        </w:numPr>
+      </w:pPr>
+      <w:r>
+        <w:t xml:space="preserve">Customer service </w:t>
+      </w:r>
+      <w:r>
+        <w:t>representatives (Internal users)</w:t>
+      </w:r>
+    </w:p>
+    <w:p>
+      <w:pPr>
+        <w:pStyle w:val="ListParagraph"/>
+        <w:numPr>
+          <w:ilvl w:val="1"/>
+          <w:numId w:val="1"/>
+        </w:numPr>
+      </w:pPr>
+      <w:r>
+        <w:t>Access shipment status</w:t>
+      </w:r>
+    </w:p>
+    <w:p>
+      <w:pPr>
+        <w:pStyle w:val="ListParagraph"/>
+        <w:numPr>
+          <w:ilvl w:val="1"/>
+          <w:numId w:val="1"/>
+        </w:numPr>
+      </w:pPr>
+      <w:r>
+        <w:t xml:space="preserve">Manage workflows related </w:t>
+      </w:r>
+      <w:proofErr w:type="spellStart"/>
+      <w:r>
+        <w:t>t</w:t>
+      </w:r>
+      <w:proofErr w:type="spellEnd"/>
+      <w:r>
+        <w:t xml:space="preserve"> customer enquires</w:t>
+      </w:r>
+    </w:p>
+    <w:p/>
+    <w:p>
+      <w:pPr>
+        <w:pStyle w:val="ListParagraph"/>
+        <w:numPr>
+          <w:ilvl w:val="0"/>
+          <w:numId w:val="1"/>
+        </w:numPr>
+      </w:pPr>
+      <w:r>
+        <w:t>Mangers</w:t>
+      </w:r>
+      <w:r>
+        <w:t xml:space="preserve"> </w:t>
+      </w:r>
+      <w:r>
+        <w:t>(</w:t>
+      </w:r>
+      <w:r>
+        <w:t>I</w:t>
+      </w:r>
+      <w:r>
+        <w:t>nternal stakeholders</w:t>
+      </w:r>
+      <w:r>
+        <w:t>)</w:t>
+      </w:r>
+    </w:p>
+    <w:p>
+      <w:pPr>
+        <w:pStyle w:val="ListParagraph"/>
+        <w:numPr>
+          <w:ilvl w:val="1"/>
+          <w:numId w:val="1"/>
+        </w:numPr>
+      </w:pPr>
+      <w:r>
+        <w:t>Monitor system reports</w:t>
+      </w:r>
+    </w:p>
+    <w:p>
+      <w:pPr>
+        <w:pStyle w:val="ListParagraph"/>
+        <w:numPr>
+          <w:ilvl w:val="1"/>
+          <w:numId w:val="1"/>
+        </w:numPr>
+      </w:pPr>
+      <w:r>
+        <w:t xml:space="preserve">Support </w:t>
+      </w:r>
+      <w:r>
+        <w:t>decision</w:t>
+      </w:r>
+      <w:r>
+        <w:t xml:space="preserve"> making</w:t>
+      </w:r>
+    </w:p>
+    <w:p/>
+    <w:p>
+      <w:pPr>
+        <w:pStyle w:val="ListParagraph"/>
+        <w:numPr>
+          <w:ilvl w:val="0"/>
+          <w:numId w:val="1"/>
+        </w:numPr>
+      </w:pPr>
+      <w:r>
+        <w:t xml:space="preserve">IT </w:t>
+      </w:r>
+      <w:r>
+        <w:t xml:space="preserve">Administrators </w:t>
+      </w:r>
+      <w:r>
+        <w:t>(</w:t>
+      </w:r>
+      <w:r>
+        <w:t>T</w:t>
+      </w:r>
+      <w:r>
+        <w:t xml:space="preserve">echnical </w:t>
+      </w:r>
+      <w:r>
+        <w:t>stakeholders)</w:t>
+      </w:r>
+    </w:p>
+    <w:p>
+      <w:pPr>
+        <w:pStyle w:val="ListParagraph"/>
+        <w:numPr>
+          <w:ilvl w:val="1"/>
+          <w:numId w:val="1"/>
+        </w:numPr>
+      </w:pPr>
+      <w:r>
+        <w:t xml:space="preserve">Maintain system performance and </w:t>
+      </w:r>
+      <w:r>
+        <w:t>security</w:t>
+      </w:r>
+    </w:p>
+    <w:p>
+      <w:pPr>
+        <w:pStyle w:val="ListParagraph"/>
+        <w:numPr>
+          <w:ilvl w:val="1"/>
+          <w:numId w:val="1"/>
+        </w:numPr>
+      </w:pPr>
+      <w:r>
+        <w:t>Mange user access</w:t>
+      </w:r>
+    </w:p>
+    <w:p/>
+    <w:p>
+      <w:pPr>
+        <w:rPr>
+          <w:b/>
+          <w:bCs/>
+        </w:rPr>
+      </w:pPr>
+      <w:r>
+        <w:rPr>
+          <w:b/>
+          <w:bCs/>
+        </w:rPr>
+        <w:t>4.</w:t>
+      </w:r>
+      <w:r>
+        <w:rPr>
+          <w:b/>
+          <w:bCs/>
+        </w:rPr>
+        <w:t xml:space="preserve">System Scope and </w:t>
+      </w:r>
+      <w:r>
+        <w:rPr>
+          <w:b/>
+          <w:bCs/>
+        </w:rPr>
+        <w:t>Boundaries</w:t>
+      </w:r>
+      <w:r>
+        <w:rPr>
+          <w:b/>
+          <w:bCs/>
+        </w:rPr>
+        <w:t xml:space="preserve">, </w:t>
+      </w:r>
+      <w:r>
+        <w:rPr>
+          <w:b/>
+          <w:bCs/>
+        </w:rPr>
+        <w:t>Assumptions</w:t>
+      </w:r>
+    </w:p>
+    <w:p/>
+    <w:p>
+      <w:r>
+        <w:t>The system will:</w:t>
+      </w:r>
+    </w:p>
+    <w:p>
+      <w:pPr>
+        <w:pStyle w:val="ListParagraph"/>
+        <w:numPr>
+          <w:ilvl w:val="0"/>
+          <w:numId w:val="1"/>
+        </w:numPr>
+      </w:pPr>
+      <w:r>
+        <w:t xml:space="preserve">Track </w:t>
+      </w:r>
+      <w:r>
+        <w:t>shipments</w:t>
+      </w:r>
+      <w:r>
+        <w:t xml:space="preserve"> </w:t>
+      </w:r>
+    </w:p>
+    <w:p>
+      <w:pPr>
+        <w:pStyle w:val="ListParagraph"/>
+        <w:numPr>
+          <w:ilvl w:val="0"/>
+          <w:numId w:val="1"/>
+        </w:numPr>
+      </w:pPr>
+      <w:r>
+        <w:t>Update shipment status</w:t>
+      </w:r>
+    </w:p>
+    <w:p>
+      <w:pPr>
+        <w:pStyle w:val="ListParagraph"/>
+        <w:numPr>
+          <w:ilvl w:val="0"/>
+          <w:numId w:val="1"/>
+        </w:numPr>
+      </w:pPr>
+      <w:r>
+        <w:t xml:space="preserve">Manage shipment </w:t>
+      </w:r>
+      <w:r>
+        <w:t>operations</w:t>
+      </w:r>
+    </w:p>
+    <w:p>
+      <w:pPr>
+        <w:pStyle w:val="ListParagraph"/>
+        <w:numPr>
+          <w:ilvl w:val="0"/>
+          <w:numId w:val="1"/>
+        </w:numPr>
+      </w:pPr>
+      <w:r>
+        <w:lastRenderedPageBreak/>
+        <w:t xml:space="preserve">Mange </w:t>
+      </w:r>
+      <w:r>
+        <w:t>workflows</w:t>
+      </w:r>
+    </w:p>
+    <w:p>
+      <w:pPr>
+        <w:pStyle w:val="ListParagraph"/>
+        <w:numPr>
+          <w:ilvl w:val="0"/>
+          <w:numId w:val="1"/>
+        </w:numPr>
+      </w:pPr>
+      <w:r>
+        <w:t>Provide tracking information</w:t>
+      </w:r>
+    </w:p>
+    <w:p>
+      <w:pPr>
+        <w:pStyle w:val="ListParagraph"/>
+        <w:numPr>
+          <w:ilvl w:val="0"/>
+          <w:numId w:val="1"/>
+        </w:numPr>
+      </w:pPr>
+      <w:r>
+        <w:t>Coordinate shipment operations</w:t>
+      </w:r>
+    </w:p>
+    <w:p/>
+    <w:p>
+      <w:r>
+        <w:t>Inside</w:t>
+      </w:r>
+      <w:r>
+        <w:t xml:space="preserve"> the system:</w:t>
+      </w:r>
+    </w:p>
+    <w:p>
+      <w:pPr>
+        <w:pStyle w:val="ListParagraph"/>
+        <w:numPr>
+          <w:ilvl w:val="0"/>
+          <w:numId w:val="1"/>
+        </w:numPr>
+      </w:pPr>
+      <w:r>
+        <w:t xml:space="preserve">Shipment tracking </w:t>
+      </w:r>
+    </w:p>
+    <w:p>
+      <w:pPr>
+        <w:pStyle w:val="ListParagraph"/>
+        <w:numPr>
+          <w:ilvl w:val="0"/>
+          <w:numId w:val="1"/>
+        </w:numPr>
+      </w:pPr>
+      <w:r>
+        <w:t>Shipment status updates</w:t>
+      </w:r>
+    </w:p>
+    <w:p>
+      <w:pPr>
+        <w:pStyle w:val="ListParagraph"/>
+        <w:numPr>
+          <w:ilvl w:val="0"/>
+          <w:numId w:val="1"/>
+        </w:numPr>
+      </w:pPr>
+      <w:r>
+        <w:t xml:space="preserve">Workflow </w:t>
+      </w:r>
+      <w:r>
+        <w:t>management</w:t>
+      </w:r>
+    </w:p>
+    <w:p>
+      <w:pPr>
+        <w:pStyle w:val="ListParagraph"/>
+        <w:numPr>
+          <w:ilvl w:val="0"/>
+          <w:numId w:val="1"/>
+        </w:numPr>
+      </w:pPr>
+      <w:r>
+        <w:t>Coordination of shipment operations</w:t>
+      </w:r>
+    </w:p>
+    <w:p/>
+    <w:p>
+      <w:r>
+        <w:t>Outside</w:t>
+      </w:r>
+      <w:r>
+        <w:t xml:space="preserve"> the system</w:t>
+      </w:r>
+    </w:p>
+    <w:p>
+      <w:pPr>
+        <w:pStyle w:val="ListParagraph"/>
+        <w:numPr>
+          <w:ilvl w:val="0"/>
+          <w:numId w:val="1"/>
+        </w:numPr>
+      </w:pPr>
+      <w:r>
+        <w:t>Payroll systems</w:t>
+      </w:r>
+    </w:p>
+    <w:p>
+      <w:pPr>
+        <w:pStyle w:val="ListParagraph"/>
+        <w:numPr>
+          <w:ilvl w:val="0"/>
+          <w:numId w:val="1"/>
+        </w:numPr>
+      </w:pPr>
+      <w:r>
+        <w:t>HR systems</w:t>
+      </w:r>
+    </w:p>
+    <w:p>
+      <w:pPr>
+        <w:pStyle w:val="ListParagraph"/>
+        <w:numPr>
+          <w:ilvl w:val="0"/>
+          <w:numId w:val="1"/>
+        </w:numPr>
+      </w:pPr>
+      <w:r>
+        <w:t>External financial systems</w:t>
+      </w:r>
+    </w:p>
+    <w:p>
+      <w:pPr>
+        <w:pStyle w:val="ListParagraph"/>
+        <w:numPr>
+          <w:ilvl w:val="0"/>
+          <w:numId w:val="1"/>
+        </w:numPr>
+      </w:pPr>
+      <w:r>
+        <w:t xml:space="preserve">Third-parry </w:t>
+      </w:r>
+      <w:r>
+        <w:t>supplies</w:t>
+      </w:r>
+      <w:r>
+        <w:t xml:space="preserve"> systems</w:t>
+      </w:r>
+    </w:p>
+    <w:p/>
+    <w:p>
+      <w:r>
+        <w:t>Assumptions :</w:t>
+      </w:r>
+    </w:p>
+    <w:p>
+      <w:pPr>
+        <w:pStyle w:val="ListParagraph"/>
+        <w:numPr>
+          <w:ilvl w:val="0"/>
+          <w:numId w:val="1"/>
+        </w:numPr>
+      </w:pPr>
+      <w:r>
+        <w:t xml:space="preserve">Users </w:t>
+      </w:r>
+      <w:r>
+        <w:t>are</w:t>
+      </w:r>
+      <w:r>
+        <w:t xml:space="preserve"> authenticated before access the system</w:t>
+      </w:r>
+    </w:p>
+    <w:p>
+      <w:pPr>
+        <w:pStyle w:val="ListParagraph"/>
+        <w:numPr>
+          <w:ilvl w:val="0"/>
+          <w:numId w:val="1"/>
+        </w:numPr>
+      </w:pPr>
+      <w:r>
+        <w:t xml:space="preserve">Shipment data is updated in </w:t>
+      </w:r>
+      <w:r>
+        <w:t>Realtime</w:t>
+      </w:r>
+      <w:r>
+        <w:t xml:space="preserve"> by staff</w:t>
+      </w:r>
+    </w:p>
+    <w:p>
+      <w:pPr>
+        <w:pStyle w:val="ListParagraph"/>
+        <w:numPr>
+          <w:ilvl w:val="0"/>
+          <w:numId w:val="1"/>
+        </w:numPr>
+      </w:pPr>
+      <w:r>
+        <w:t xml:space="preserve">Customers have </w:t>
+      </w:r>
+      <w:r>
+        <w:t>limited</w:t>
+      </w:r>
+      <w:r>
+        <w:t xml:space="preserve"> access to </w:t>
+      </w:r>
+      <w:r>
+        <w:t>tracking</w:t>
+      </w:r>
+      <w:r>
+        <w:t xml:space="preserve"> </w:t>
+      </w:r>
+      <w:r>
+        <w:t>information</w:t>
+      </w:r>
+    </w:p>
+    <w:p>
+      <w:pPr>
+        <w:pStyle w:val="ListParagraph"/>
+        <w:numPr>
+          <w:ilvl w:val="0"/>
+          <w:numId w:val="1"/>
+        </w:numPr>
+      </w:pPr>
+      <w:r>
+        <w:t xml:space="preserve">The system operates </w:t>
+      </w:r>
+      <w:r>
+        <w:t>through</w:t>
+      </w:r>
+      <w:r>
+        <w:t xml:space="preserve"> an online platform</w:t>
+      </w:r>
+    </w:p>
+    <w:p>
+      <w:pPr>
+        <w:pStyle w:val="ListParagraph"/>
+        <w:numPr>
+          <w:ilvl w:val="0"/>
+          <w:numId w:val="1"/>
+        </w:numPr>
+      </w:pPr>
+      <w:r>
+        <w:t>The system is used across multiple departments</w:t>
+      </w:r>
+    </w:p>
+    <w:p>
+      <w:pPr>
+        <w:rPr>
+          <w:b/>
+          <w:bCs/>
+        </w:rPr>
+      </w:pPr>
+    </w:p>
+    <w:p>
+      <w:pPr>
+        <w:rPr>
+          <w:b/>
+          <w:bCs/>
+        </w:rPr>
+      </w:pPr>
+      <w:r>
+        <w:rPr>
+          <w:b/>
+          <w:bCs/>
+        </w:rPr>
+        <w:t xml:space="preserve">Task 2 </w:t>
+      </w:r>
+    </w:p>
+    <w:p>
+      <w:pPr>
+        <w:rPr>
+          <w:b/>
+          <w:bCs/>
+        </w:rPr>
+      </w:pPr>
+      <w:r>
+        <w:rPr>
+          <w:b/>
+          <w:bCs/>
+        </w:rPr>
+        <w:t>Clearly defined functional requirements:</w:t>
+      </w:r>
+    </w:p>
+    <w:p>
+      <w:r>
+        <w:t xml:space="preserve">What are functional </w:t>
+      </w:r>
+      <w:r>
+        <w:t>requirements</w:t>
+      </w:r>
+      <w:r>
+        <w:t>?</w:t>
+      </w:r>
+    </w:p>
+    <w:p>
+      <w:r>
+        <w:t>Functional</w:t>
+      </w:r>
+      <w:r>
+        <w:t xml:space="preserve"> requirements define the s</w:t>
+      </w:r>
+      <w:r>
+        <w:t>p</w:t>
+      </w:r>
+      <w:r>
+        <w:t>e</w:t>
+      </w:r>
+      <w:r>
+        <w:t>cif</w:t>
+      </w:r>
+      <w:r>
+        <w:t xml:space="preserve">ic actions, </w:t>
+      </w:r>
+      <w:r>
+        <w:t>behaviour</w:t>
+      </w:r>
+      <w:r>
+        <w:t xml:space="preserve"> and data a processing system must </w:t>
+      </w:r>
+      <w:r>
+        <w:t>perform</w:t>
+      </w:r>
+      <w:r>
+        <w:t xml:space="preserve"> to meet user needs</w:t>
+      </w:r>
+    </w:p>
+    <w:p>
+      <w:r>
+        <w:t xml:space="preserve">To identify </w:t>
+      </w:r>
+      <w:r>
+        <w:t>these,</w:t>
+      </w:r>
+      <w:r>
+        <w:t xml:space="preserve"> we focus on the functionality, using verbs like “ calculate”, “display” or “process”</w:t>
+      </w:r>
+      <w:r>
+        <w:t>.</w:t>
+      </w:r>
+    </w:p>
+    <w:p/>
+    <w:p>
+      <w:r>
+        <w:t>Verbs = actions</w:t>
+      </w:r>
+    </w:p>
+    <w:p>
+      <w:r>
+        <w:lastRenderedPageBreak/>
+        <w:t>Actions = what the system does</w:t>
+      </w:r>
+    </w:p>
+    <w:p>
+      <w:r>
+        <w:t>What the system does = Functional requirements</w:t>
+      </w:r>
+    </w:p>
+    <w:p/>
+    <w:p>
+      <w:r>
+        <w:t>Functional requirements:</w:t>
+      </w:r>
+    </w:p>
+    <w:p>
+      <w:pPr>
+        <w:pStyle w:val="ListParagraph"/>
+        <w:numPr>
+          <w:ilvl w:val="0"/>
+          <w:numId w:val="1"/>
+        </w:numPr>
+      </w:pPr>
+      <w:r>
+        <w:t xml:space="preserve">The system shall allow users to </w:t>
+      </w:r>
+      <w:r>
+        <w:t>track shipments</w:t>
+      </w:r>
+    </w:p>
+    <w:p>
+      <w:pPr>
+        <w:pStyle w:val="ListParagraph"/>
+        <w:numPr>
+          <w:ilvl w:val="0"/>
+          <w:numId w:val="1"/>
+        </w:numPr>
+      </w:pPr>
+      <w:r>
+        <w:t>The system shall allow staff to update shipment status</w:t>
+      </w:r>
+    </w:p>
+    <w:p>
+      <w:pPr>
+        <w:pStyle w:val="ListParagraph"/>
+        <w:numPr>
+          <w:ilvl w:val="0"/>
+          <w:numId w:val="1"/>
+        </w:numPr>
+      </w:pPr>
+      <w:r>
+        <w:t>The system shall manage shipment operations</w:t>
+      </w:r>
+    </w:p>
+    <w:p>
+      <w:pPr>
+        <w:pStyle w:val="ListParagraph"/>
+        <w:numPr>
+          <w:ilvl w:val="0"/>
+          <w:numId w:val="1"/>
+        </w:numPr>
+      </w:pPr>
+      <w:r>
+        <w:t>The system shall manage workflows</w:t>
+      </w:r>
+    </w:p>
+    <w:p>
+      <w:pPr>
+        <w:pStyle w:val="ListParagraph"/>
+        <w:numPr>
+          <w:ilvl w:val="0"/>
+          <w:numId w:val="1"/>
+        </w:numPr>
+      </w:pPr>
+      <w:r>
+        <w:t>The system shall provide tracking information to customers</w:t>
+      </w:r>
+    </w:p>
+    <w:p>
+      <w:pPr>
+        <w:pStyle w:val="ListParagraph"/>
+        <w:numPr>
+          <w:ilvl w:val="0"/>
+          <w:numId w:val="1"/>
+        </w:numPr>
+      </w:pPr>
+      <w:r>
+        <w:t>The system shall coordinate shipment operations across departments</w:t>
+      </w:r>
+    </w:p>
+    <w:p>
+      <w:pPr>
+        <w:rPr>
+          <w:b/>
+          <w:bCs/>
+        </w:rPr>
+      </w:pPr>
+    </w:p>
+    <w:p>
+      <w:pPr>
+        <w:rPr>
+          <w:b/>
+          <w:bCs/>
+        </w:rPr>
+      </w:pPr>
+      <w:r>
+        <w:rPr>
+          <w:b/>
+          <w:bCs/>
+        </w:rPr>
+        <w:t>Clearly defined Non – Functional requirements</w:t>
+      </w:r>
+    </w:p>
+    <w:p>
+      <w:pPr>
+        <w:rPr>
+          <w:b/>
+          <w:bCs/>
+        </w:rPr>
+      </w:pPr>
+    </w:p>
+    <w:p>
+      <w:r>
+        <w:t xml:space="preserve">These are the system quality </w:t>
+      </w:r>
+      <w:r>
+        <w:t>attributes;</w:t>
+      </w:r>
+      <w:r>
+        <w:t xml:space="preserve"> this covers how well the system does it.</w:t>
+      </w:r>
+    </w:p>
+    <w:p/>
+    <w:p>
+      <w:pPr>
+        <w:pStyle w:val="ListParagraph"/>
+        <w:numPr>
+          <w:ilvl w:val="0"/>
+          <w:numId w:val="1"/>
+        </w:numPr>
+      </w:pPr>
+      <w:r>
+        <w:t>Performance</w:t>
+      </w:r>
+    </w:p>
+    <w:p>
+      <w:pPr>
+        <w:pStyle w:val="ListParagraph"/>
+        <w:numPr>
+          <w:ilvl w:val="1"/>
+          <w:numId w:val="1"/>
+        </w:numPr>
+      </w:pPr>
+      <w:r>
+        <w:t>The system shall return shipment tracking results within 2 seconds</w:t>
+      </w:r>
+    </w:p>
+    <w:p>
+      <w:pPr>
+        <w:pStyle w:val="ListParagraph"/>
+        <w:numPr>
+          <w:ilvl w:val="1"/>
+          <w:numId w:val="1"/>
+        </w:numPr>
+      </w:pPr>
+      <w:r>
+        <w:t xml:space="preserve">The system shall process shipment updates without </w:t>
+      </w:r>
+      <w:r>
+        <w:t>noticeable</w:t>
+      </w:r>
+      <w:r>
+        <w:t xml:space="preserve"> delay</w:t>
+      </w:r>
+    </w:p>
+    <w:p>
+      <w:pPr>
+        <w:pStyle w:val="ListParagraph"/>
+        <w:numPr>
+          <w:ilvl w:val="0"/>
+          <w:numId w:val="1"/>
+        </w:numPr>
+      </w:pPr>
+      <w:r>
+        <w:t>Availability</w:t>
+      </w:r>
+    </w:p>
+    <w:p>
+      <w:pPr>
+        <w:pStyle w:val="ListParagraph"/>
+        <w:numPr>
+          <w:ilvl w:val="1"/>
+          <w:numId w:val="1"/>
+        </w:numPr>
+      </w:pPr>
+      <w:r>
+        <w:t xml:space="preserve">The system shall be </w:t>
+      </w:r>
+      <w:r>
+        <w:t>available</w:t>
+      </w:r>
+      <w:r>
+        <w:t xml:space="preserve"> 24/7 for all users</w:t>
+      </w:r>
+    </w:p>
+    <w:p>
+      <w:pPr>
+        <w:pStyle w:val="ListParagraph"/>
+        <w:numPr>
+          <w:ilvl w:val="1"/>
+          <w:numId w:val="1"/>
+        </w:numPr>
+      </w:pPr>
+      <w:r>
+        <w:t>The system shall minimise downtime during maintenance</w:t>
+      </w:r>
+    </w:p>
+    <w:p>
+      <w:pPr>
+        <w:pStyle w:val="ListParagraph"/>
+        <w:numPr>
+          <w:ilvl w:val="0"/>
+          <w:numId w:val="1"/>
+        </w:numPr>
+      </w:pPr>
+      <w:r>
+        <w:t>Security</w:t>
+      </w:r>
+    </w:p>
+    <w:p>
+      <w:pPr>
+        <w:pStyle w:val="ListParagraph"/>
+        <w:numPr>
+          <w:ilvl w:val="1"/>
+          <w:numId w:val="1"/>
+        </w:numPr>
+      </w:pPr>
+      <w:r>
+        <w:t xml:space="preserve">The system shall require user </w:t>
+      </w:r>
+      <w:r>
+        <w:t>authentication</w:t>
+      </w:r>
+      <w:r>
+        <w:t xml:space="preserve"> before access </w:t>
+      </w:r>
+    </w:p>
+    <w:p>
+      <w:pPr>
+        <w:pStyle w:val="ListParagraph"/>
+        <w:numPr>
+          <w:ilvl w:val="1"/>
+          <w:numId w:val="1"/>
+        </w:numPr>
+      </w:pPr>
+      <w:r>
+        <w:t xml:space="preserve">The system shall ensure only </w:t>
+      </w:r>
+      <w:r>
+        <w:t>authorised</w:t>
+      </w:r>
+      <w:r>
+        <w:t xml:space="preserve"> uses can modify shipment data</w:t>
+      </w:r>
+    </w:p>
+    <w:p>
+      <w:pPr>
+        <w:pStyle w:val="ListParagraph"/>
+        <w:numPr>
+          <w:ilvl w:val="1"/>
+          <w:numId w:val="1"/>
+        </w:numPr>
+      </w:pPr>
+      <w:r>
+        <w:t xml:space="preserve">The system shall protect shipment information </w:t>
+      </w:r>
+      <w:r>
+        <w:t>from</w:t>
+      </w:r>
+      <w:r>
+        <w:t xml:space="preserve"> </w:t>
+      </w:r>
+      <w:r>
+        <w:t>unauthorised</w:t>
+      </w:r>
+      <w:r>
+        <w:t xml:space="preserve"> access</w:t>
+      </w:r>
+    </w:p>
+    <w:p>
+      <w:pPr>
+        <w:pStyle w:val="ListParagraph"/>
+        <w:numPr>
+          <w:ilvl w:val="0"/>
+          <w:numId w:val="1"/>
+        </w:numPr>
+      </w:pPr>
+      <w:r>
+        <w:t>Usability</w:t>
+      </w:r>
+    </w:p>
+    <w:p>
+      <w:pPr>
+        <w:pStyle w:val="ListParagraph"/>
+        <w:numPr>
+          <w:ilvl w:val="1"/>
+          <w:numId w:val="1"/>
+        </w:numPr>
+      </w:pPr>
+      <w:r>
+        <w:t xml:space="preserve">The system should </w:t>
+      </w:r>
+      <w:r>
+        <w:t>prov</w:t>
+      </w:r>
+      <w:r>
+        <w:t xml:space="preserve">ide a user- friendly and </w:t>
+      </w:r>
+      <w:r>
+        <w:t>intuitive</w:t>
+      </w:r>
+      <w:r>
+        <w:t xml:space="preserve"> interface</w:t>
+      </w:r>
+    </w:p>
+    <w:p>
+      <w:pPr>
+        <w:pStyle w:val="ListParagraph"/>
+        <w:numPr>
+          <w:ilvl w:val="1"/>
+          <w:numId w:val="1"/>
+        </w:numPr>
+      </w:pPr>
+      <w:r>
+        <w:t>The system should allow users to easily navigate an access required features</w:t>
+      </w:r>
+    </w:p>
+    <w:p>
+      <w:pPr>
+        <w:pStyle w:val="ListParagraph"/>
+        <w:numPr>
+          <w:ilvl w:val="0"/>
+          <w:numId w:val="1"/>
+        </w:numPr>
+      </w:pPr>
+      <w:r>
+        <w:t>Reliability/Data integrity</w:t>
+      </w:r>
+    </w:p>
+    <w:p>
+      <w:pPr>
+        <w:pStyle w:val="ListParagraph"/>
+        <w:numPr>
+          <w:ilvl w:val="1"/>
+          <w:numId w:val="1"/>
+        </w:numPr>
+      </w:pPr>
+      <w:r>
+        <w:t>The system shall ensure shipment data is accurate and consistent</w:t>
+      </w:r>
+    </w:p>
+    <w:p>
+      <w:pPr>
+        <w:pStyle w:val="ListParagraph"/>
+        <w:numPr>
+          <w:ilvl w:val="1"/>
+          <w:numId w:val="1"/>
+        </w:numPr>
+      </w:pPr>
+      <w:r>
+        <w:t xml:space="preserve">The system shall </w:t>
+      </w:r>
+      <w:r>
+        <w:t>pr</w:t>
+      </w:r>
+      <w:r>
+        <w:t xml:space="preserve">event data loss </w:t>
+      </w:r>
+      <w:r>
+        <w:t>d</w:t>
+      </w:r>
+      <w:r>
+        <w:t>uring system operations</w:t>
+      </w:r>
+    </w:p>
+    <w:p>
+      <w:pPr>
+        <w:pStyle w:val="ListParagraph"/>
+        <w:numPr>
+          <w:ilvl w:val="1"/>
+          <w:numId w:val="1"/>
+        </w:numPr>
+      </w:pPr>
+      <w:r>
+        <w:t>The system shall maintain up-to-date shipment information</w:t>
+      </w:r>
+    </w:p>
+    <w:p>
+      <w:pPr>
+        <w:rPr>
+          <w:b/>
+          <w:bCs/>
+        </w:rPr>
+      </w:pPr>
+    </w:p>
+    <w:p>
+      <w:pPr>
+        <w:rPr>
+          <w:b/>
+          <w:bCs/>
+        </w:rPr>
+      </w:pPr>
+      <w:r>
+        <w:rPr>
+          <w:b/>
+          <w:bCs/>
+        </w:rPr>
+        <w:t>Traceability between stakeholders and requirements</w:t>
+      </w:r>
+    </w:p>
+    <w:p>
+      <w:r>
+        <w:lastRenderedPageBreak/>
+        <w:t>Tra</w:t>
+      </w:r>
+      <w:r>
+        <w:t>ec</w:t>
+      </w:r>
+      <w:r>
+        <w:t xml:space="preserve">bility can be summarized as </w:t>
+      </w:r>
+      <w:r>
+        <w:t xml:space="preserve">: </w:t>
+      </w:r>
+    </w:p>
+    <w:p>
+      <w:r>
+        <w:t xml:space="preserve">A </w:t>
+      </w:r>
+      <w:r>
+        <w:t>requirement</w:t>
+      </w:r>
+      <w:r>
+        <w:t xml:space="preserve"> exists because this stakeholder needs it. It means that every </w:t>
+      </w:r>
+      <w:r>
+        <w:t>requirement</w:t>
+      </w:r>
+      <w:r>
+        <w:t xml:space="preserve"> must answer who needs this</w:t>
+      </w:r>
+      <w:r>
+        <w:t>?</w:t>
+      </w:r>
+      <w:r>
+        <w:t xml:space="preserve"> and why?</w:t>
+      </w:r>
+    </w:p>
+    <w:p>
+      <w:r>
+        <w:t>elicitation → specification → validation</w:t>
+      </w:r>
+    </w:p>
+    <w:p>
+      <w:r>
+        <w:t>SO,</w:t>
+      </w:r>
+      <w:r>
+        <w:t xml:space="preserve"> the </w:t>
+      </w:r>
+      <w:r>
+        <w:t>traceability</w:t>
+      </w:r>
+      <w:r>
+        <w:t xml:space="preserve"> for my project is as follows:</w:t>
+      </w:r>
+    </w:p>
+    <w:p>
+      <w:pPr>
+        <w:pStyle w:val="ListParagraph"/>
+        <w:numPr>
+          <w:ilvl w:val="0"/>
+          <w:numId w:val="1"/>
+        </w:numPr>
+      </w:pPr>
+      <w:r>
+        <w:t xml:space="preserve">Customers require the system to track </w:t>
+      </w:r>
+      <w:r>
+        <w:t>shipments</w:t>
+      </w:r>
+      <w:r>
+        <w:t xml:space="preserve"> and view shipment status</w:t>
+      </w:r>
+    </w:p>
+    <w:p>
+      <w:pPr>
+        <w:pStyle w:val="ListParagraph"/>
+        <w:numPr>
+          <w:ilvl w:val="0"/>
+          <w:numId w:val="1"/>
+        </w:numPr>
+      </w:pPr>
+      <w:r>
+        <w:t xml:space="preserve">Operation staff require the system to update shipment status and </w:t>
+      </w:r>
+      <w:r>
+        <w:t>manage</w:t>
+      </w:r>
+      <w:r>
+        <w:t xml:space="preserve"> the </w:t>
+      </w:r>
+      <w:r>
+        <w:t>shipment</w:t>
+      </w:r>
+      <w:r>
+        <w:t xml:space="preserve"> data</w:t>
+      </w:r>
+    </w:p>
+    <w:p>
+      <w:pPr>
+        <w:pStyle w:val="ListParagraph"/>
+        <w:numPr>
+          <w:ilvl w:val="0"/>
+          <w:numId w:val="1"/>
+        </w:numPr>
+      </w:pPr>
+      <w:r>
+        <w:t>Customer se</w:t>
+      </w:r>
+      <w:r>
+        <w:t>rvi</w:t>
+      </w:r>
+      <w:r>
+        <w:t xml:space="preserve">ce </w:t>
+      </w:r>
+      <w:r>
+        <w:t>representative</w:t>
+      </w:r>
+      <w:r>
+        <w:t xml:space="preserve"> </w:t>
+      </w:r>
+      <w:r>
+        <w:t>requires</w:t>
+      </w:r>
+      <w:r>
+        <w:t xml:space="preserve"> the system to access shipment </w:t>
+      </w:r>
+      <w:r>
+        <w:t>status</w:t>
+      </w:r>
+      <w:r>
+        <w:t xml:space="preserve"> and manage </w:t>
+      </w:r>
+      <w:r>
+        <w:t>workflows</w:t>
+      </w:r>
+    </w:p>
+    <w:p>
+      <w:pPr>
+        <w:pStyle w:val="ListParagraph"/>
+        <w:numPr>
+          <w:ilvl w:val="0"/>
+          <w:numId w:val="1"/>
+        </w:numPr>
+      </w:pPr>
+      <w:r>
+        <w:t>Managers require the system to view reports and support decision making</w:t>
+      </w:r>
+    </w:p>
+    <w:p>
+      <w:pPr>
+        <w:pStyle w:val="ListParagraph"/>
+        <w:numPr>
+          <w:ilvl w:val="0"/>
+          <w:numId w:val="1"/>
+        </w:numPr>
+      </w:pPr>
+      <w:r>
+        <w:t xml:space="preserve">IT </w:t>
+      </w:r>
+      <w:r>
+        <w:t>administrators</w:t>
+      </w:r>
+      <w:r>
+        <w:t xml:space="preserve"> require the system to manage user access and maintain system performance</w:t>
+      </w:r>
+      <w:r>
+        <w:t>.</w:t>
+      </w:r>
+    </w:p>
     <w:sectPr>
       <w:pgSz w:w="11906" w:h="16838"/>
       <w:pgMar w:top="1440" w:right="1440" w:bottom="1440" w:left="1440" w:header="708" w:footer="708" w:gutter="0"/>
@@ -11,6 +2609,310 @@
     </w:sectPr>
   </w:body>
 </w:document>
+</file>
+
+<file path=word/numbering.xml><?xml version="1.0" encoding="utf-8"?>
+<w:numbering xmlns:wpc="http://schemas.microsoft.com/office/word/2010/wordprocessingCanvas" xmlns:cx="http://schemas.microsoft.com/office/drawing/2014/chartex" xmlns:cx1="http://schemas.microsoft.com/office/drawing/2015/9/8/chartex" xmlns:cx2="http://schemas.microsoft.com/office/drawing/2015/10/21/chartex" xmlns:cx3="http://schemas.microsoft.com/office/drawing/2016/5/9/chartex" xmlns:cx4="http://schemas.microsoft.com/office/drawing/2016/5/10/chartex" xmlns:cx5="http://schemas.microsoft.com/office/drawing/2016/5/11/chartex" xmlns:cx6="http://schemas.microsoft.com/office/drawing/2016/5/12/chartex" xmlns:cx7="http://schemas.microsoft.com/office/drawing/2016/5/13/chartex" xmlns:cx8="http://schemas.microsoft.com/office/drawing/2016/5/14/chartex" xmlns:mc="http://schemas.openxmlformats.org/markup-compatibility/2006" xmlns:aink="http://schemas.microsoft.com/office/drawing/2016/ink" xmlns:am3d="http://schemas.microsoft.com/office/drawing/2017/model3d" xmlns:o="urn:schemas-microsoft-com:office:office" xmlns:oel="http://schemas.microsoft.com/office/2019/extlst" xmlns:r="http://schemas.openxmlformats.org/officeDocument/2006/relationships" xmlns:m="http://schemas.openxmlformats.org/officeDocument/2006/math" xmlns:v="urn:schemas-microsoft-com:vml" xmlns:wp14="http://schemas.microsoft.com/office/word/2010/wordprocessingDrawing" xmlns:wp="http://schemas.openxmlformats.org/drawingml/2006/wordprocessingDrawing" xmlns:w10="urn:schemas-microsoft-com:office:word" xmlns:w="http://schemas.openxmlformats.org/wordprocessingml/2006/main" xmlns:w14="http://schemas.microsoft.com/office/word/2010/wordml" xmlns:w15="http://schemas.microsoft.com/office/word/2012/wordml" xmlns:w16cex="http://schemas.microsoft.com/office/word/2018/wordml/cex" xmlns:w16cid="http://schemas.microsoft.com/office/word/2016/wordml/cid" xmlns:w16="http://schemas.microsoft.com/office/word/2018/wordml" xmlns:w16du="http://schemas.microsoft.com/office/word/2023/wordml/word16du" xmlns:w16sdtdh="http://schemas.microsoft.com/office/word/2020/wordml/sdtdatahash" xmlns:w16sdtfl="http://schemas.microsoft.com/office/word/2024/wordml/sdtformatlock" xmlns:w16se="http://schemas.microsoft.com/office/word/2015/wordml/symex" xmlns:wpg="http://schemas.microsoft.com/office/word/2010/wordprocessingGroup" xmlns:wpi="http://schemas.microsoft.com/office/word/2010/wordprocessingInk" xmlns:wne="http://schemas.microsoft.com/office/word/2006/wordml" xmlns:wps="http://schemas.microsoft.com/office/word/2010/wordprocessingShape" mc:Ignorable="w14 w15 w16se w16cid w16 w16cex w16sdtdh w16sdtfl w16du wp14">
+  <w:abstractNum w:abstractNumId="0" w15:restartNumberingAfterBreak="0">
+    <w:nsid w:val="2504502A"/>
+    <w:multiLevelType w:val="hybridMultilevel"/>
+    <w:tmpl w:val="CF8E1B38"/>
+    <w:lvl w:ilvl="0" w:tplc="1409000F">
+      <w:start w:val="1"/>
+      <w:numFmt w:val="decimal"/>
+      <w:lvlText w:val="%1."/>
+      <w:lvlJc w:val="left"/>
+      <w:pPr>
+        <w:ind w:left="720" w:hanging="360"/>
+      </w:pPr>
+      <w:rPr>
+        <w:rFonts w:hint="default"/>
+      </w:rPr>
+    </w:lvl>
+    <w:lvl w:ilvl="1" w:tplc="14090019" w:tentative="1">
+      <w:start w:val="1"/>
+      <w:numFmt w:val="lowerLetter"/>
+      <w:lvlText w:val="%2."/>
+      <w:lvlJc w:val="left"/>
+      <w:pPr>
+        <w:ind w:left="1440" w:hanging="360"/>
+      </w:pPr>
+    </w:lvl>
+    <w:lvl w:ilvl="2" w:tplc="1409001B" w:tentative="1">
+      <w:start w:val="1"/>
+      <w:numFmt w:val="lowerRoman"/>
+      <w:lvlText w:val="%3."/>
+      <w:lvlJc w:val="right"/>
+      <w:pPr>
+        <w:ind w:left="2160" w:hanging="180"/>
+      </w:pPr>
+    </w:lvl>
+    <w:lvl w:ilvl="3" w:tplc="1409000F" w:tentative="1">
+      <w:start w:val="1"/>
+      <w:numFmt w:val="decimal"/>
+      <w:lvlText w:val="%4."/>
+      <w:lvlJc w:val="left"/>
+      <w:pPr>
+        <w:ind w:left="2880" w:hanging="360"/>
+      </w:pPr>
+    </w:lvl>
+    <w:lvl w:ilvl="4" w:tplc="14090019" w:tentative="1">
+      <w:start w:val="1"/>
+      <w:numFmt w:val="lowerLetter"/>
+      <w:lvlText w:val="%5."/>
+      <w:lvlJc w:val="left"/>
+      <w:pPr>
+        <w:ind w:left="3600" w:hanging="360"/>
+      </w:pPr>
+    </w:lvl>
+    <w:lvl w:ilvl="5" w:tplc="1409001B" w:tentative="1">
+      <w:start w:val="1"/>
+      <w:numFmt w:val="lowerRoman"/>
+      <w:lvlText w:val="%6."/>
+      <w:lvlJc w:val="right"/>
+      <w:pPr>
+        <w:ind w:left="4320" w:hanging="180"/>
+      </w:pPr>
+    </w:lvl>
+    <w:lvl w:ilvl="6" w:tplc="1409000F" w:tentative="1">
+      <w:start w:val="1"/>
+      <w:numFmt w:val="decimal"/>
+      <w:lvlText w:val="%7."/>
+      <w:lvlJc w:val="left"/>
+      <w:pPr>
+        <w:ind w:left="5040" w:hanging="360"/>
+      </w:pPr>
+    </w:lvl>
+    <w:lvl w:ilvl="7" w:tplc="14090019" w:tentative="1">
+      <w:start w:val="1"/>
+      <w:numFmt w:val="lowerLetter"/>
+      <w:lvlText w:val="%8."/>
+      <w:lvlJc w:val="left"/>
+      <w:pPr>
+        <w:ind w:left="5760" w:hanging="360"/>
+      </w:pPr>
+    </w:lvl>
+    <w:lvl w:ilvl="8" w:tplc="1409001B" w:tentative="1">
+      <w:start w:val="1"/>
+      <w:numFmt w:val="lowerRoman"/>
+      <w:lvlText w:val="%9."/>
+      <w:lvlJc w:val="right"/>
+      <w:pPr>
+        <w:ind w:left="6480" w:hanging="180"/>
+      </w:pPr>
+    </w:lvl>
+  </w:abstractNum>
+  <w:abstractNum w:abstractNumId="1" w15:restartNumberingAfterBreak="0">
+    <w:nsid w:val="4AA31A14"/>
+    <w:multiLevelType w:val="hybridMultilevel"/>
+    <w:tmpl w:val="468244AA"/>
+    <w:lvl w:ilvl="0" w:tplc="1409000F">
+      <w:start w:val="3"/>
+      <w:numFmt w:val="decimal"/>
+      <w:lvlText w:val="%1."/>
+      <w:lvlJc w:val="left"/>
+      <w:pPr>
+        <w:ind w:left="720" w:hanging="360"/>
+      </w:pPr>
+      <w:rPr>
+        <w:rFonts w:hint="default"/>
+      </w:rPr>
+    </w:lvl>
+    <w:lvl w:ilvl="1" w:tplc="14090019" w:tentative="1">
+      <w:start w:val="1"/>
+      <w:numFmt w:val="lowerLetter"/>
+      <w:lvlText w:val="%2."/>
+      <w:lvlJc w:val="left"/>
+      <w:pPr>
+        <w:ind w:left="1440" w:hanging="360"/>
+      </w:pPr>
+    </w:lvl>
+    <w:lvl w:ilvl="2" w:tplc="1409001B" w:tentative="1">
+      <w:start w:val="1"/>
+      <w:numFmt w:val="lowerRoman"/>
+      <w:lvlText w:val="%3."/>
+      <w:lvlJc w:val="right"/>
+      <w:pPr>
+        <w:ind w:left="2160" w:hanging="180"/>
+      </w:pPr>
+    </w:lvl>
+    <w:lvl w:ilvl="3" w:tplc="1409000F" w:tentative="1">
+      <w:start w:val="1"/>
+      <w:numFmt w:val="decimal"/>
+      <w:lvlText w:val="%4."/>
+      <w:lvlJc w:val="left"/>
+      <w:pPr>
+        <w:ind w:left="2880" w:hanging="360"/>
+      </w:pPr>
+    </w:lvl>
+    <w:lvl w:ilvl="4" w:tplc="14090019" w:tentative="1">
+      <w:start w:val="1"/>
+      <w:numFmt w:val="lowerLetter"/>
+      <w:lvlText w:val="%5."/>
+      <w:lvlJc w:val="left"/>
+      <w:pPr>
+        <w:ind w:left="3600" w:hanging="360"/>
+      </w:pPr>
+    </w:lvl>
+    <w:lvl w:ilvl="5" w:tplc="1409001B" w:tentative="1">
+      <w:start w:val="1"/>
+      <w:numFmt w:val="lowerRoman"/>
+      <w:lvlText w:val="%6."/>
+      <w:lvlJc w:val="right"/>
+      <w:pPr>
+        <w:ind w:left="4320" w:hanging="180"/>
+      </w:pPr>
+    </w:lvl>
+    <w:lvl w:ilvl="6" w:tplc="1409000F" w:tentative="1">
+      <w:start w:val="1"/>
+      <w:numFmt w:val="decimal"/>
+      <w:lvlText w:val="%7."/>
+      <w:lvlJc w:val="left"/>
+      <w:pPr>
+        <w:ind w:left="5040" w:hanging="360"/>
+      </w:pPr>
+    </w:lvl>
+    <w:lvl w:ilvl="7" w:tplc="14090019" w:tentative="1">
+      <w:start w:val="1"/>
+      <w:numFmt w:val="lowerLetter"/>
+      <w:lvlText w:val="%8."/>
+      <w:lvlJc w:val="left"/>
+      <w:pPr>
+        <w:ind w:left="5760" w:hanging="360"/>
+      </w:pPr>
+    </w:lvl>
+    <w:lvl w:ilvl="8" w:tplc="1409001B" w:tentative="1">
+      <w:start w:val="1"/>
+      <w:numFmt w:val="lowerRoman"/>
+      <w:lvlText w:val="%9."/>
+      <w:lvlJc w:val="right"/>
+      <w:pPr>
+        <w:ind w:left="6480" w:hanging="180"/>
+      </w:pPr>
+    </w:lvl>
+  </w:abstractNum>
+  <w:abstractNum w:abstractNumId="2" w15:restartNumberingAfterBreak="0">
+    <w:nsid w:val="7ECC256C"/>
+    <w:multiLevelType w:val="hybridMultilevel"/>
+    <w:tmpl w:val="EB7C7300"/>
+    <w:lvl w:ilvl="0" w:tplc="3F4233E2">
+      <w:numFmt w:val="bullet"/>
+      <w:lvlText w:val="-"/>
+      <w:lvlJc w:val="left"/>
+      <w:pPr>
+        <w:ind w:left="720" w:hanging="360"/>
+      </w:pPr>
+      <w:rPr>
+        <w:rFonts w:ascii="Aptos" w:eastAsiaTheme="minorHAnsi" w:hAnsi="Aptos" w:cstheme="minorBidi" w:hint="default"/>
+      </w:rPr>
+    </w:lvl>
+    <w:lvl w:ilvl="1" w:tplc="14090003">
+      <w:start w:val="1"/>
+      <w:numFmt w:val="bullet"/>
+      <w:lvlText w:val="o"/>
+      <w:lvlJc w:val="left"/>
+      <w:pPr>
+        <w:ind w:left="1440" w:hanging="360"/>
+      </w:pPr>
+      <w:rPr>
+        <w:rFonts w:ascii="Courier New" w:hAnsi="Courier New" w:cs="Courier New" w:hint="default"/>
+      </w:rPr>
+    </w:lvl>
+    <w:lvl w:ilvl="2" w:tplc="14090005" w:tentative="1">
+      <w:start w:val="1"/>
+      <w:numFmt w:val="bullet"/>
+      <w:lvlText w:val=""/>
+      <w:lvlJc w:val="left"/>
+      <w:pPr>
+        <w:ind w:left="2160" w:hanging="360"/>
+      </w:pPr>
+      <w:rPr>
+        <w:rFonts w:ascii="Wingdings" w:hAnsi="Wingdings" w:hint="default"/>
+      </w:rPr>
+    </w:lvl>
+    <w:lvl w:ilvl="3" w:tplc="14090001" w:tentative="1">
+      <w:start w:val="1"/>
+      <w:numFmt w:val="bullet"/>
+      <w:lvlText w:val=""/>
+      <w:lvlJc w:val="left"/>
+      <w:pPr>
+        <w:ind w:left="2880" w:hanging="360"/>
+      </w:pPr>
+      <w:rPr>
+        <w:rFonts w:ascii="Symbol" w:hAnsi="Symbol" w:hint="default"/>
+      </w:rPr>
+    </w:lvl>
+    <w:lvl w:ilvl="4" w:tplc="14090003" w:tentative="1">
+      <w:start w:val="1"/>
+      <w:numFmt w:val="bullet"/>
+      <w:lvlText w:val="o"/>
+      <w:lvlJc w:val="left"/>
+      <w:pPr>
+        <w:ind w:left="3600" w:hanging="360"/>
+      </w:pPr>
+      <w:rPr>
+        <w:rFonts w:ascii="Courier New" w:hAnsi="Courier New" w:cs="Courier New" w:hint="default"/>
+      </w:rPr>
+    </w:lvl>
+    <w:lvl w:ilvl="5" w:tplc="14090005" w:tentative="1">
+      <w:start w:val="1"/>
+      <w:numFmt w:val="bullet"/>
+      <w:lvlText w:val=""/>
+      <w:lvlJc w:val="left"/>
+      <w:pPr>
+        <w:ind w:left="4320" w:hanging="360"/>
+      </w:pPr>
+      <w:rPr>
+        <w:rFonts w:ascii="Wingdings" w:hAnsi="Wingdings" w:hint="default"/>
+      </w:rPr>
+    </w:lvl>
+    <w:lvl w:ilvl="6" w:tplc="14090001" w:tentative="1">
+      <w:start w:val="1"/>
+      <w:numFmt w:val="bullet"/>
+      <w:lvlText w:val=""/>
+      <w:lvlJc w:val="left"/>
+      <w:pPr>
+        <w:ind w:left="5040" w:hanging="360"/>
+      </w:pPr>
+      <w:rPr>
+        <w:rFonts w:ascii="Symbol" w:hAnsi="Symbol" w:hint="default"/>
+      </w:rPr>
+    </w:lvl>
+    <w:lvl w:ilvl="7" w:tplc="14090003" w:tentative="1">
+      <w:start w:val="1"/>
+      <w:numFmt w:val="bullet"/>
+      <w:lvlText w:val="o"/>
+      <w:lvlJc w:val="left"/>
+      <w:pPr>
+        <w:ind w:left="5760" w:hanging="360"/>
+      </w:pPr>
+      <w:rPr>
+        <w:rFonts w:ascii="Courier New" w:hAnsi="Courier New" w:cs="Courier New" w:hint="default"/>
+      </w:rPr>
+    </w:lvl>
+    <w:lvl w:ilvl="8" w:tplc="14090005" w:tentative="1">
+      <w:start w:val="1"/>
+      <w:numFmt w:val="bullet"/>
+      <w:lvlText w:val=""/>
+      <w:lvlJc w:val="left"/>
+      <w:pPr>
+        <w:ind w:left="6480" w:hanging="360"/>
+      </w:pPr>
+      <w:rPr>
+        <w:rFonts w:ascii="Wingdings" w:hAnsi="Wingdings" w:hint="default"/>
+      </w:rPr>
+    </w:lvl>
+  </w:abstractNum>
+  <w:num w:numId="1" w16cid:durableId="449280155">
+    <w:abstractNumId w:val="2"/>
+  </w:num>
+  <w:num w:numId="2" w16cid:durableId="949897403">
+    <w:abstractNumId w:val="0"/>
+  </w:num>
+  <w:num w:numId="3" w16cid:durableId="565799713">
+    <w:abstractNumId w:val="1"/>
+  </w:num>
+</w:numbering>
 </file>
 
 <file path=word/styles.xml><?xml version="1.0" encoding="utf-8"?>
@@ -616,7 +3518,6 @@
   <w:style w:type="character" w:default="1" w:styleId="DefaultParagraphFont">
     <w:name w:val="Default Paragraph Font"/>
     <w:uiPriority w:val="1"/>
-    <w:semiHidden/>
     <w:unhideWhenUsed/>
   </w:style>
   <w:style w:type="table" w:default="1" w:styleId="TableNormal">

</xml_diff>